<commit_message>
Remove old files 3
</commit_message>
<xml_diff>
--- a/documentation/USER_GUIDE.docx
+++ b/documentation/USER_GUIDE.docx
@@ -6,10 +6,16 @@
       <w:pPr>
         <w:pStyle w:val="Heading1"/>
         <w:bidi/>
+        <w:rPr>
+          <w:sz w:val="32"/>
+          <w:szCs w:val="32"/>
+        </w:rPr>
       </w:pPr>
       <w:r>
         <w:rPr>
           <w:rFonts w:ascii="Arial" w:hAnsi="Arial"/>
+          <w:sz w:val="32"/>
+          <w:szCs w:val="32"/>
           <w:rtl/>
         </w:rPr>
         <w:t>מדריך למשתמש</w:t>
@@ -18,12 +24,87 @@
     <w:p>
       <w:pPr>
         <w:bidi/>
-      </w:pPr>
-      <w:r>
-        <w:rPr>
-          <w:rtl/>
-        </w:rPr>
-        <w:t>המדריך מתאר את סדר ההפעלה של הפרויקט. אם קובצי הביניים כבר קיימים, אפשר להתחיל מהשלב הרלוונטי ואין צורך לייצר את כל הנתונים מחדש.</w:t>
+        <w:rPr>
+          <w:rtl/>
+          <w:lang w:bidi="he-IL"/>
+        </w:rPr>
+      </w:pPr>
+      <w:r>
+        <w:rPr>
+          <w:rtl/>
+        </w:rPr>
+        <w:t xml:space="preserve">המדריך מתאר את סדר ההפעלה של הפרויקט. </w:t>
+      </w:r>
+      <w:r>
+        <w:rPr>
+          <w:rFonts w:hint="cs"/>
+          <w:rtl/>
+          <w:lang w:bidi="he-IL"/>
+        </w:rPr>
+        <w:t>קבצי הנתונים</w:t>
+      </w:r>
+      <w:r>
+        <w:rPr>
+          <w:rtl/>
+        </w:rPr>
+        <w:t xml:space="preserve"> כבר קיימים</w:t>
+      </w:r>
+      <w:r>
+        <w:rPr>
+          <w:rFonts w:hint="cs"/>
+          <w:rtl/>
+          <w:lang w:bidi="he-IL"/>
+        </w:rPr>
+        <w:t xml:space="preserve"> בתיקיית הפרויקט</w:t>
+      </w:r>
+      <w:r>
+        <w:rPr>
+          <w:rtl/>
+        </w:rPr>
+        <w:t xml:space="preserve">, </w:t>
+      </w:r>
+      <w:r>
+        <w:rPr>
+          <w:rFonts w:hint="cs"/>
+          <w:rtl/>
+          <w:lang w:bidi="he-IL"/>
+        </w:rPr>
+        <w:t>לכן ניתן להריץ את הניסויים כמתואר למטה ללא צורך ביצירתם . במידה ומעוניינים ליצור אותם</w:t>
+      </w:r>
+      <w:r>
+        <w:rPr>
+          <w:rFonts w:hint="cs"/>
+          <w:rtl/>
+          <w:lang w:bidi="he-IL"/>
+        </w:rPr>
+        <w:t xml:space="preserve"> מחדש</w:t>
+      </w:r>
+      <w:r>
+        <w:rPr>
+          <w:rFonts w:hint="cs"/>
+          <w:rtl/>
+          <w:lang w:bidi="he-IL"/>
+        </w:rPr>
+        <w:t xml:space="preserve"> יש לפנות </w:t>
+      </w:r>
+      <w:r>
+        <w:rPr>
+          <w:rFonts w:hint="cs"/>
+          <w:rtl/>
+          <w:lang w:bidi="he-IL"/>
+        </w:rPr>
+        <w:t>לקבצי ה</w:t>
+      </w:r>
+      <w:r>
+        <w:t xml:space="preserve">מדריך לבודק ובתיעוד למתכנת </w:t>
+      </w:r>
+      <w:r>
+        <w:rPr>
+          <w:rFonts w:hint="cs"/>
+          <w:rtl/>
+          <w:lang w:bidi="he-IL"/>
+        </w:rPr>
+        <w:t>.</w:t>
       </w:r>
     </w:p>
     <w:p>
@@ -291,6 +372,44 @@
           <w:rtl/>
         </w:rPr>
         <w:t>לפני כל הרצה חשוב לוודא שה-Dataset המתאים מופיע ברשימת הקלטים של המחברת.</w:t>
+      </w:r>
+      <w:r>
+        <w:rPr>
+          <w:rFonts w:hint="cs"/>
+          <w:rtl/>
+          <w:lang w:bidi="he-IL"/>
+        </w:rPr>
+        <w:t xml:space="preserve"> בקישורים למטה קבצי הקלט הנדרשים להרצת כל ניסוי</w:t>
+      </w:r>
+      <w:r>
+        <w:rPr>
+          <w:rFonts w:hint="cs"/>
+          <w:rtl/>
+          <w:lang w:bidi="he-IL"/>
+        </w:rPr>
+        <w:t xml:space="preserve"> כבר</w:t>
+      </w:r>
+      <w:r>
+        <w:rPr>
+          <w:rFonts w:hint="cs"/>
+          <w:rtl/>
+          <w:lang w:bidi="he-IL"/>
+        </w:rPr>
+        <w:t xml:space="preserve"> מצויים כקלט במחברות אלה תחת סעיף </w:t>
+      </w:r>
+      <w:r>
+        <w:rPr>
+          <w:lang w:bidi="he-IL"/>
+        </w:rPr>
+        <w:t>input</w:t>
+      </w:r>
+      <w:r>
+        <w:rPr>
+          <w:rFonts w:hint="cs"/>
+          <w:rtl/>
+          <w:lang w:bidi="he-IL"/>
+        </w:rPr>
+        <w:t xml:space="preserve"> .</w:t>
       </w:r>
     </w:p>
     <w:p>
@@ -490,53 +609,160 @@
           <w:rFonts w:ascii="Courier New" w:hAnsi="Courier New"/>
           <w:sz w:val="19"/>
         </w:rPr>
-        <w:t xml:space="preserve"> notebook:      [להוסיף קישור]</w:t>
+        <w:t xml:space="preserve"> notebook:     </w:t>
+      </w:r>
+      <w:hyperlink r:id="rId6" w:history="1">
+        <w:r>
+          <w:rPr>
+            <w:rStyle w:val="Hyperlink"/>
+          </w:rPr>
+          <w:t>https://www.kaggle.com/code/alonlev001/</w:t>
+        </w:r>
+        <w:r>
+          <w:rPr>
+            <w:rStyle w:val="Hyperlink"/>
+          </w:rPr>
+          <w:t>a</w:t>
+        </w:r>
+        <w:r>
+          <w:rPr>
+            <w:rStyle w:val="Hyperlink"/>
+          </w:rPr>
+          <w:t>rchive-cnn</w:t>
+        </w:r>
+      </w:hyperlink>
+      <w:r>
+        <w:br/>
       </w:r>
     </w:p>
     <w:p/>
     <w:p/>
-    <w:p/>
     <w:p>
       <w:pPr>
         <w:pStyle w:val="Heading2"/>
         <w:bidi/>
-      </w:pPr>
+        <w:rPr>
+          <w:sz w:val="32"/>
+          <w:szCs w:val="32"/>
+          <w:rtl/>
+          <w:lang w:bidi="he-IL"/>
+        </w:rPr>
+      </w:pPr>
+      <w:r>
+        <w:rPr>
+          <w:rFonts w:ascii="Arial" w:hAnsi="Arial" w:hint="cs"/>
+          <w:sz w:val="32"/>
+          <w:szCs w:val="32"/>
+          <w:rtl/>
+          <w:lang w:bidi="he-IL"/>
+        </w:rPr>
+        <w:t>3</w:t>
+      </w:r>
       <w:r>
         <w:rPr>
           <w:rFonts w:ascii="Arial" w:hAnsi="Arial"/>
-          <w:rtl/>
-        </w:rPr>
-        <w:lastRenderedPageBreak/>
-        <w:t>3. מבנה קובצי האודיו</w:t>
+          <w:sz w:val="32"/>
+          <w:szCs w:val="32"/>
+          <w:rtl/>
+        </w:rPr>
+        <w:t xml:space="preserve">. </w:t>
+      </w:r>
+      <w:r>
+        <w:rPr>
+          <w:rFonts w:ascii="Arial" w:hAnsi="Arial" w:hint="cs"/>
+          <w:sz w:val="32"/>
+          <w:szCs w:val="32"/>
+          <w:rtl/>
+          <w:lang w:bidi="he-IL"/>
+        </w:rPr>
+        <w:t>הרצת הניסויים</w:t>
       </w:r>
     </w:p>
     <w:p>
       <w:pPr>
+        <w:pStyle w:val="Heading2"/>
         <w:bidi/>
       </w:pPr>
       <w:r>
         <w:rPr>
-          <w:rtl/>
-        </w:rPr>
-        <w:t>נתוני הדיבור החופשי לאחר איחוד המקורות נמצאים במבנה:</w:t>
+          <w:rFonts w:ascii="Arial" w:hAnsi="Arial" w:hint="cs"/>
+          <w:rtl/>
+          <w:lang w:bidi="he-IL"/>
+        </w:rPr>
+        <w:t>3.1</w:t>
+      </w:r>
+      <w:r>
+        <w:rPr>
+          <w:rFonts w:ascii="Arial" w:hAnsi="Arial"/>
+          <w:rtl/>
+        </w:rPr>
+        <w:t>. הרצת מסווגי למידת מכונה</w:t>
       </w:r>
     </w:p>
     <w:p>
+      <w:pPr>
+        <w:bidi/>
+      </w:pPr>
+      <w:r>
+        <w:rPr>
+          <w:rtl/>
+        </w:rPr>
+        <w:t>פותחים את:</w:t>
+      </w:r>
+    </w:p>
+    <w:p>
       <w:r>
         <w:rPr>
           <w:rFonts w:ascii="Courier New" w:hAnsi="Courier New"/>
           <w:sz w:val="19"/>
         </w:rPr>
-        <w:t>audio_by_accent_raw/</w:t>
+        <w:t>main</w:t>
+      </w:r>
+      <w:r>
+        <w:rPr>
+          <w:rFonts w:ascii="Courier New" w:hAnsi="Courier New"/>
+          <w:sz w:val="19"/>
+        </w:rPr>
+        <w:t xml:space="preserve"> </w:t>
+      </w:r>
+      <w:r>
+        <w:rPr>
+          <w:rFonts w:ascii="Courier New" w:hAnsi="Courier New"/>
+          <w:sz w:val="19"/>
+        </w:rPr>
+        <w:t>_machine_learning.py</w:t>
       </w:r>
     </w:p>
     <w:p>
+      <w:pPr>
+        <w:bidi/>
+      </w:pPr>
+      <w:r>
+        <w:rPr>
+          <w:rtl/>
+        </w:rPr>
+        <w:t>ובוחרים את מצב הנתונים</w:t>
+      </w:r>
+      <w:r>
+        <w:rPr>
+          <w:rFonts w:hint="cs"/>
+          <w:rtl/>
+          <w:lang w:bidi="he-IL"/>
+        </w:rPr>
+        <w:t xml:space="preserve"> (</w:t>
+      </w:r>
       <w:r>
         <w:rPr>
           <w:rFonts w:ascii="Courier New" w:hAnsi="Courier New"/>
           <w:sz w:val="19"/>
         </w:rPr>
-        <w:t>├── chinese/</w:t>
+        <w:t>(free_text/mixed/archive_only</w:t>
+      </w:r>
+      <w:r>
+        <w:rPr>
+          <w:rtl/>
+        </w:rPr>
+        <w:t>:</w:t>
       </w:r>
     </w:p>
     <w:p>
@@ -545,16 +771,27 @@
           <w:rFonts w:ascii="Courier New" w:hAnsi="Courier New"/>
           <w:sz w:val="19"/>
         </w:rPr>
-        <w:t>├── indian/</w:t>
+        <w:t>RUN_MODE = "free_text"</w:t>
       </w:r>
     </w:p>
     <w:p>
+      <w:pPr>
+        <w:bidi/>
+      </w:pPr>
+      <w:r>
+        <w:rPr>
+          <w:rtl/>
+        </w:rPr>
+        <w:t>אפשר להפעיל בחירת פיצ'רים ולקבוע את מספר הפיצ'רים:</w:t>
+      </w:r>
+    </w:p>
+    <w:p>
       <w:r>
         <w:rPr>
           <w:rFonts w:ascii="Courier New" w:hAnsi="Courier New"/>
           <w:sz w:val="19"/>
         </w:rPr>
-        <w:t>├── nigerian/</w:t>
+        <w:t>ENABLE_FEATURE_SELECTION = False</w:t>
       </w:r>
     </w:p>
     <w:p>
@@ -563,7 +800,7 @@
           <w:rFonts w:ascii="Courier New" w:hAnsi="Courier New"/>
           <w:sz w:val="19"/>
         </w:rPr>
-        <w:t>└── usa/</w:t>
+        <w:t>TOP_K_FEATURES = 30</w:t>
       </w:r>
     </w:p>
     <w:p>
@@ -574,7 +811,7 @@
         <w:rPr>
           <w:rtl/>
         </w:rPr>
-        <w:t>נתוני Speech Accent Archive נמצאים במבנה:</w:t>
+        <w:t>מצב כוונון ההיפר-פרמטרים נקבע באמצעות:</w:t>
       </w:r>
     </w:p>
     <w:p>
@@ -583,76 +820,702 @@
           <w:rFonts w:ascii="Courier New" w:hAnsi="Courier New"/>
           <w:sz w:val="19"/>
         </w:rPr>
-        <w:t>accents_audio/</w:t>
+        <w:t>TUNING_MODE = "random_search"</w:t>
       </w:r>
     </w:p>
     <w:p>
+      <w:pPr>
+        <w:bidi/>
+        <w:rPr>
+          <w:rtl/>
+          <w:lang w:bidi="he-IL"/>
+        </w:rPr>
+      </w:pPr>
+      <w:r>
+        <w:rPr>
+          <w:rtl/>
+        </w:rPr>
+        <w:t>לאחר בחירת ההגדרות מריצים את הקובץ.</w:t>
+      </w:r>
+    </w:p>
+    <w:p>
+      <w:pPr>
+        <w:pStyle w:val="Heading2"/>
+        <w:bidi/>
+        <w:rPr>
+          <w:rFonts w:ascii="Arial" w:hAnsi="Arial"/>
+          <w:rtl/>
+          <w:lang w:bidi="he-IL"/>
+        </w:rPr>
+      </w:pPr>
+      <w:r>
+        <w:rPr>
+          <w:rFonts w:ascii="Arial" w:hAnsi="Arial" w:hint="cs"/>
+          <w:rtl/>
+          <w:lang w:bidi="he-IL"/>
+        </w:rPr>
+        <w:t>3.2</w:t>
+      </w:r>
+      <w:r>
+        <w:rPr>
+          <w:rFonts w:ascii="Arial" w:hAnsi="Arial"/>
+          <w:rtl/>
+        </w:rPr>
+        <w:t xml:space="preserve"> הרצת </w:t>
+      </w:r>
+      <w:r>
+        <w:rPr>
+          <w:rFonts w:ascii="Arial" w:hAnsi="Arial" w:hint="cs"/>
+          <w:rtl/>
+          <w:lang w:bidi="he-IL"/>
+        </w:rPr>
+        <w:t xml:space="preserve">ניסוי השוואת ספקטוגרמות על מאגר </w:t>
+      </w:r>
+      <w:r>
+        <w:rPr>
+          <w:rFonts w:asciiTheme="majorBidi" w:hAnsiTheme="majorBidi"/>
+          <w:lang w:bidi="he-IL"/>
+        </w:rPr>
+        <w:t>archive</w:t>
+      </w:r>
+      <w:r>
+        <w:rPr>
+          <w:rFonts w:ascii="Arial" w:hAnsi="Arial" w:hint="cs"/>
+          <w:rtl/>
+          <w:lang w:bidi="he-IL"/>
+        </w:rPr>
+        <w:t xml:space="preserve"> :</w:t>
+      </w:r>
+    </w:p>
+    <w:p>
+      <w:pPr>
+        <w:bidi/>
+        <w:rPr>
+          <w:rtl/>
+          <w:lang w:bidi="he-IL"/>
+        </w:rPr>
+      </w:pPr>
+    </w:p>
+    <w:p>
       <w:r>
         <w:rPr>
           <w:rFonts w:ascii="Courier New" w:hAnsi="Courier New"/>
           <w:sz w:val="19"/>
-        </w:rPr>
-        <w:t>└── accent_archive/</w:t>
+          <w:lang w:bidi="he-IL"/>
+        </w:rPr>
+        <w:t>archive</w:t>
+      </w:r>
+      <w:r>
+        <w:rPr>
+          <w:rFonts w:ascii="Courier New" w:hAnsi="Courier New"/>
+          <w:sz w:val="19"/>
+        </w:rPr>
+        <w:t>_cnn.py</w:t>
       </w:r>
     </w:p>
     <w:p>
+      <w:pPr>
+        <w:bidi/>
+      </w:pPr>
+      <w:r>
+        <w:rPr>
+          <w:rtl/>
+          <w:lang w:bidi="he-IL"/>
+        </w:rPr>
+        <w:t>הניסוי</w:t>
+      </w:r>
+      <w:r>
+        <w:rPr>
+          <w:rtl/>
+        </w:rPr>
+        <w:t xml:space="preserve"> </w:t>
+      </w:r>
+      <w:r>
+        <w:rPr>
+          <w:rtl/>
+          <w:lang w:bidi="he-IL"/>
+        </w:rPr>
+        <w:t>משתמש</w:t>
+      </w:r>
+      <w:r>
+        <w:rPr>
+          <w:rtl/>
+        </w:rPr>
+        <w:t xml:space="preserve"> </w:t>
+      </w:r>
+      <w:r>
+        <w:rPr>
+          <w:rtl/>
+          <w:lang w:bidi="he-IL"/>
+        </w:rPr>
+        <w:t>בתיקיית</w:t>
+      </w:r>
+      <w:r>
+        <w:rPr>
+          <w:rtl/>
+        </w:rPr>
+        <w:t xml:space="preserve"> </w:t>
+      </w:r>
+      <w:r>
+        <w:t xml:space="preserve"> </w:t>
+      </w:r>
+      <w:r>
+        <w:t>archive_cnn_dataset</w:t>
+      </w:r>
+      <w:r>
+        <w:t>\</w:t>
+      </w:r>
+      <w:r>
+        <w:t xml:space="preserve"> </w:t>
+      </w:r>
+      <w:r>
+        <w:rPr>
+          <w:rtl/>
+          <w:lang w:bidi="he-IL"/>
+        </w:rPr>
+        <w:t>ואינו</w:t>
+      </w:r>
+      <w:r>
+        <w:rPr>
+          <w:rtl/>
+        </w:rPr>
+        <w:t xml:space="preserve"> </w:t>
+      </w:r>
+      <w:r>
+        <w:rPr>
+          <w:rtl/>
+          <w:lang w:bidi="he-IL"/>
+        </w:rPr>
+        <w:t>משתמש</w:t>
+      </w:r>
+      <w:r>
+        <w:rPr>
+          <w:rtl/>
+        </w:rPr>
+        <w:t xml:space="preserve"> </w:t>
+      </w:r>
+      <w:r>
+        <w:rPr>
+          <w:rtl/>
+          <w:lang w:bidi="he-IL"/>
+        </w:rPr>
+        <w:t>בתיקיות</w:t>
+      </w:r>
+      <w:r>
+        <w:rPr>
+          <w:rtl/>
+        </w:rPr>
+        <w:t xml:space="preserve"> </w:t>
+      </w:r>
+      <w:r>
+        <w:rPr>
+          <w:rtl/>
+          <w:lang w:bidi="he-IL"/>
+        </w:rPr>
+        <w:t>הספקטרוגרמות</w:t>
+      </w:r>
+      <w:r>
+        <w:rPr>
+          <w:rtl/>
+        </w:rPr>
+        <w:t xml:space="preserve"> </w:t>
+      </w:r>
+      <w:r>
+        <w:rPr>
+          <w:rtl/>
+          <w:lang w:bidi="he-IL"/>
+        </w:rPr>
+        <w:t>של</w:t>
+      </w:r>
+      <w:r>
+        <w:rPr>
+          <w:rtl/>
+        </w:rPr>
+        <w:t xml:space="preserve"> </w:t>
+      </w:r>
+      <w:r>
+        <w:rPr>
+          <w:rtl/>
+          <w:lang w:bidi="he-IL"/>
+        </w:rPr>
+        <w:t>ניסויי</w:t>
+      </w:r>
+      <w:r>
+        <w:rPr>
+          <w:rtl/>
+        </w:rPr>
+        <w:t xml:space="preserve"> </w:t>
+      </w:r>
+      <w:r>
+        <w:rPr>
+          <w:rtl/>
+          <w:lang w:bidi="he-IL"/>
+        </w:rPr>
+        <w:t>ה־</w:t>
+      </w:r>
+      <w:r>
+        <w:t xml:space="preserve">CNN </w:t>
+      </w:r>
+      <w:r>
+        <w:rPr>
+          <w:rtl/>
+          <w:lang w:bidi="he-IL"/>
+        </w:rPr>
+        <w:t>האחרים</w:t>
+      </w:r>
+      <w:r>
+        <w:t>.</w:t>
+      </w:r>
+    </w:p>
+    <w:p>
+      <w:pPr>
+        <w:pStyle w:val="Heading2"/>
+        <w:bidi/>
+      </w:pPr>
+      <w:r>
+        <w:rPr>
+          <w:rFonts w:ascii="Arial" w:hAnsi="Arial" w:hint="cs"/>
+          <w:rtl/>
+          <w:lang w:bidi="he-IL"/>
+        </w:rPr>
+        <w:t>3.3</w:t>
+      </w:r>
+      <w:r>
+        <w:rPr>
+          <w:rFonts w:ascii="Arial" w:hAnsi="Arial"/>
+          <w:rtl/>
+        </w:rPr>
+        <w:t xml:space="preserve"> הרצת המודל האקוסטי</w:t>
+      </w:r>
+    </w:p>
+    <w:p>
+      <w:pPr>
+        <w:bidi/>
+      </w:pPr>
+      <w:r>
+        <w:rPr>
+          <w:rtl/>
+        </w:rPr>
+        <w:t>למודל האקוסטי מריצים:</w:t>
+      </w:r>
+    </w:p>
+    <w:p>
       <w:r>
         <w:rPr>
           <w:rFonts w:ascii="Courier New" w:hAnsi="Courier New"/>
           <w:sz w:val="19"/>
         </w:rPr>
-        <w:t xml:space="preserve">    ├── chinese/</w:t>
+        <w:t>main_cnn.py</w:t>
       </w:r>
     </w:p>
     <w:p>
+      <w:pPr>
+        <w:bidi/>
+        <w:rPr>
+          <w:lang w:bidi="he-IL"/>
+        </w:rPr>
+      </w:pPr>
+      <w:r>
+        <w:rPr>
+          <w:rFonts w:hint="cs"/>
+          <w:rtl/>
+          <w:lang w:bidi="he-IL"/>
+        </w:rPr>
+        <w:t xml:space="preserve">בתוך הקוד </w:t>
+      </w:r>
+      <w:r>
+        <w:rPr>
+          <w:rtl/>
+        </w:rPr>
+        <w:t xml:space="preserve">יש לבחור את </w:t>
+      </w:r>
+      <w:r>
+        <w:rPr>
+          <w:rFonts w:hint="cs"/>
+          <w:rtl/>
+          <w:lang w:bidi="he-IL"/>
+        </w:rPr>
+        <w:t>מאגר</w:t>
+      </w:r>
+      <w:r>
+        <w:rPr>
+          <w:rtl/>
+        </w:rPr>
+        <w:t xml:space="preserve"> הנתונים</w:t>
+      </w:r>
+      <w:r>
+        <w:rPr>
+          <w:rFonts w:hint="cs"/>
+          <w:rtl/>
+          <w:lang w:bidi="he-IL"/>
+        </w:rPr>
+        <w:t xml:space="preserve"> עליו רצים  (</w:t>
+      </w:r>
       <w:r>
         <w:rPr>
           <w:rFonts w:ascii="Courier New" w:hAnsi="Courier New"/>
           <w:sz w:val="19"/>
         </w:rPr>
-        <w:t xml:space="preserve">    ├── hindi/</w:t>
+        <w:t>(free_text/mixed</w:t>
+      </w:r>
+      <w:r>
+        <w:rPr>
+          <w:rFonts w:hint="cs"/>
+          <w:rtl/>
+          <w:lang w:bidi="he-IL"/>
+        </w:rPr>
+        <w:t xml:space="preserve"> :</w:t>
       </w:r>
     </w:p>
     <w:p>
+      <w:pPr>
+        <w:rPr>
+          <w:rtl/>
+          <w:lang w:bidi="he-IL"/>
+        </w:rPr>
+      </w:pPr>
       <w:r>
         <w:rPr>
           <w:rFonts w:ascii="Courier New" w:hAnsi="Courier New"/>
           <w:sz w:val="19"/>
         </w:rPr>
-        <w:t xml:space="preserve">    ├── nigerian/</w:t>
+        <w:t>RUN_MODE = "free_text"</w:t>
       </w:r>
     </w:p>
     <w:p>
+      <w:pPr>
+        <w:bidi/>
+      </w:pPr>
+      <w:r>
+        <w:rPr>
+          <w:rtl/>
+        </w:rPr>
+        <w:t>המודל משתמש בספקטרוגרמות של מצב הנתונים שנבחר.</w:t>
+      </w:r>
+    </w:p>
+    <w:p>
+      <w:pPr>
+        <w:pStyle w:val="Heading2"/>
+        <w:bidi/>
+      </w:pPr>
+      <w:r>
+        <w:rPr>
+          <w:rFonts w:ascii="Arial" w:hAnsi="Arial" w:hint="cs"/>
+          <w:rtl/>
+          <w:lang w:bidi="he-IL"/>
+        </w:rPr>
+        <w:t>3.4</w:t>
+      </w:r>
+      <w:r>
+        <w:rPr>
+          <w:rFonts w:ascii="Arial" w:hAnsi="Arial"/>
+          <w:rtl/>
+        </w:rPr>
+        <w:t xml:space="preserve"> הרצת המודל המולטי-מודאלי</w:t>
+      </w:r>
+    </w:p>
+    <w:p>
+      <w:pPr>
+        <w:bidi/>
+        <w:rPr>
+          <w:rtl/>
+          <w:lang w:bidi="he-IL"/>
+        </w:rPr>
+      </w:pPr>
+      <w:r>
+        <w:rPr>
+          <w:rtl/>
+        </w:rPr>
+        <w:t>למודל המולטי-מודאלי מריצים:</w:t>
+      </w:r>
+    </w:p>
+    <w:p>
       <w:r>
         <w:rPr>
           <w:rFonts w:ascii="Courier New" w:hAnsi="Courier New"/>
           <w:sz w:val="19"/>
         </w:rPr>
-        <w:t xml:space="preserve">    └── usa/</w:t>
+        <w:t>m</w:t>
+      </w:r>
+      <w:r>
+        <w:rPr>
+          <w:rFonts w:ascii="Courier New" w:hAnsi="Courier New"/>
+          <w:sz w:val="19"/>
+        </w:rPr>
+        <w:t>ain_m</w:t>
+      </w:r>
+      <w:r>
+        <w:rPr>
+          <w:rFonts w:ascii="Courier New" w:hAnsi="Courier New"/>
+          <w:sz w:val="19"/>
+        </w:rPr>
+        <w:t>ultimodal_</w:t>
+      </w:r>
+      <w:r>
+        <w:rPr>
+          <w:rFonts w:ascii="Courier New" w:hAnsi="Courier New"/>
+          <w:sz w:val="19"/>
+        </w:rPr>
+        <w:t>cnn</w:t>
+      </w:r>
+      <w:r>
+        <w:rPr>
+          <w:rFonts w:ascii="Courier New" w:hAnsi="Courier New"/>
+          <w:sz w:val="19"/>
+        </w:rPr>
+        <w:t>.py</w:t>
       </w:r>
     </w:p>
     <w:p>
       <w:pPr>
         <w:bidi/>
-      </w:pPr>
-      <w:r>
-        <w:rPr>
-          <w:rtl/>
-        </w:rPr>
-        <w:t>כל אחת מהתיקיות מכילה את קובצי האודיו של המבטא המתאים.</w:t>
+        <w:rPr>
+          <w:lang w:bidi="he-IL"/>
+        </w:rPr>
+      </w:pPr>
+      <w:r>
+        <w:rPr>
+          <w:rFonts w:hint="cs"/>
+          <w:rtl/>
+          <w:lang w:bidi="he-IL"/>
+        </w:rPr>
+        <w:t xml:space="preserve">בתוך הקוד </w:t>
+      </w:r>
+      <w:r>
+        <w:rPr>
+          <w:rtl/>
+        </w:rPr>
+        <w:t xml:space="preserve">יש לבחור את </w:t>
+      </w:r>
+      <w:r>
+        <w:rPr>
+          <w:rFonts w:hint="cs"/>
+          <w:rtl/>
+          <w:lang w:bidi="he-IL"/>
+        </w:rPr>
+        <w:t>מאגר</w:t>
+      </w:r>
+      <w:r>
+        <w:rPr>
+          <w:rtl/>
+        </w:rPr>
+        <w:t xml:space="preserve"> הנתונים</w:t>
+      </w:r>
+      <w:r>
+        <w:rPr>
+          <w:rFonts w:hint="cs"/>
+          <w:rtl/>
+          <w:lang w:bidi="he-IL"/>
+        </w:rPr>
+        <w:t xml:space="preserve"> עליו רצים  (</w:t>
+      </w:r>
+      <w:r>
+        <w:rPr>
+          <w:rFonts w:ascii="Courier New" w:hAnsi="Courier New"/>
+          <w:sz w:val="19"/>
+        </w:rPr>
+        <w:t>(free_text/mixed</w:t>
+      </w:r>
+      <w:r>
+        <w:rPr>
+          <w:rFonts w:hint="cs"/>
+          <w:rtl/>
+          <w:lang w:bidi="he-IL"/>
+        </w:rPr>
+        <w:t xml:space="preserve"> :</w:t>
       </w:r>
     </w:p>
     <w:p>
       <w:pPr>
+        <w:rPr>
+          <w:rtl/>
+          <w:lang w:bidi="he-IL"/>
+        </w:rPr>
+      </w:pPr>
+      <w:r>
+        <w:rPr>
+          <w:rFonts w:ascii="Courier New" w:hAnsi="Courier New"/>
+          <w:sz w:val="19"/>
+        </w:rPr>
+        <w:t>RUN_MODE = "free_text"</w:t>
+      </w:r>
+    </w:p>
+    <w:p>
+      <w:pPr>
+        <w:bidi/>
+        <w:rPr>
+          <w:rtl/>
+          <w:lang w:bidi="he-IL"/>
+        </w:rPr>
+      </w:pPr>
+      <w:r>
+        <w:rPr>
+          <w:rtl/>
+        </w:rPr>
+        <w:t>לפני ההרצה יש לוודא שקיימים גם קובצי הספקטרוגרמות וגם קובץ הפיצ'רים המתאים לאותו מצב.</w:t>
+      </w:r>
+    </w:p>
+    <w:p>
+      <w:pPr>
+        <w:bidi/>
+        <w:rPr>
+          <w:rtl/>
+          <w:lang w:bidi="he-IL"/>
+        </w:rPr>
+      </w:pPr>
+      <w:r>
+        <w:rPr>
+          <w:rFonts w:hint="cs"/>
+          <w:rtl/>
+          <w:lang w:bidi="he-IL"/>
+        </w:rPr>
+        <w:lastRenderedPageBreak/>
+        <w:t xml:space="preserve">כל </w:t>
+      </w:r>
+      <w:r>
+        <w:rPr>
+          <w:rFonts w:hint="cs"/>
+          <w:rtl/>
+          <w:lang w:bidi="he-IL"/>
+        </w:rPr>
+        <w:t>קבצי הניסויים</w:t>
+      </w:r>
+      <w:r>
+        <w:rPr>
+          <w:rFonts w:hint="cs"/>
+          <w:rtl/>
+          <w:lang w:bidi="he-IL"/>
+        </w:rPr>
+        <w:t xml:space="preserve"> מצויים גם כמחבר</w:t>
+      </w:r>
+      <w:r>
+        <w:rPr>
+          <w:rFonts w:hint="cs"/>
+          <w:rtl/>
+          <w:lang w:bidi="he-IL"/>
+        </w:rPr>
+        <w:t>ו</w:t>
+      </w:r>
+      <w:r>
+        <w:rPr>
+          <w:rFonts w:hint="cs"/>
+          <w:rtl/>
+          <w:lang w:bidi="he-IL"/>
+        </w:rPr>
+        <w:t xml:space="preserve">ת </w:t>
+      </w:r>
+      <w:r>
+        <w:rPr>
+          <w:lang w:bidi="he-IL"/>
+        </w:rPr>
+        <w:t>kaggle</w:t>
+      </w:r>
+      <w:r>
+        <w:rPr>
+          <w:rFonts w:hint="cs"/>
+          <w:rtl/>
+          <w:lang w:bidi="he-IL"/>
+        </w:rPr>
+        <w:t xml:space="preserve"> (קישורים בעמוד הראשון)</w:t>
+      </w:r>
+      <w:r>
+        <w:rPr>
+          <w:rFonts w:hint="cs"/>
+          <w:rtl/>
+          <w:lang w:bidi="he-IL"/>
+        </w:rPr>
+        <w:t xml:space="preserve"> ביחד עם קבצי הקלט הנדרשים .</w:t>
+      </w:r>
+      <w:r>
+        <w:rPr>
+          <w:rFonts w:hint="cs"/>
+          <w:rtl/>
+          <w:lang w:bidi="he-IL"/>
+        </w:rPr>
+        <w:t xml:space="preserve"> מומלץ להריץ ב </w:t>
+      </w:r>
+      <w:r>
+        <w:rPr>
+          <w:lang w:bidi="he-IL"/>
+        </w:rPr>
+        <w:t>kaggle</w:t>
+      </w:r>
+      <w:r>
+        <w:rPr>
+          <w:rFonts w:hint="cs"/>
+          <w:rtl/>
+          <w:lang w:bidi="he-IL"/>
+        </w:rPr>
+        <w:t xml:space="preserve"> לצורך חיסכון משמעותי בזמן ריצה.</w:t>
+      </w:r>
+      <w:r>
+        <w:rPr>
+          <w:rFonts w:hint="cs"/>
+          <w:rtl/>
+          <w:lang w:bidi="he-IL"/>
+        </w:rPr>
+        <w:t xml:space="preserve"> נשים לב כי יתכנו </w:t>
+      </w:r>
+      <w:r>
+        <w:rPr>
+          <w:rtl/>
+          <w:lang w:bidi="he-IL"/>
+        </w:rPr>
+        <w:t>הבדלים בתוצאות בין הרצות שבוצעו בסביבת</w:t>
+      </w:r>
+      <w:r>
+        <w:rPr>
+          <w:lang w:bidi="he-IL"/>
+        </w:rPr>
+        <w:t xml:space="preserve"> Kaggle </w:t>
+      </w:r>
+      <w:r>
+        <w:rPr>
+          <w:rtl/>
+          <w:lang w:bidi="he-IL"/>
+        </w:rPr>
+        <w:t>לבין הרצות מקומיות ב־</w:t>
+      </w:r>
+      <w:r>
+        <w:rPr>
+          <w:lang w:bidi="he-IL"/>
+        </w:rPr>
+        <w:t>PyChar</w:t>
+      </w:r>
+      <w:r>
+        <w:rPr>
+          <w:lang w:bidi="he-IL"/>
+        </w:rPr>
+        <w:t>m</w:t>
+      </w:r>
+      <w:r>
+        <w:rPr>
+          <w:rFonts w:hint="cs"/>
+          <w:rtl/>
+          <w:lang w:bidi="he-IL"/>
+        </w:rPr>
+        <w:t xml:space="preserve"> .</w:t>
+      </w:r>
+    </w:p>
+    <w:p>
+      <w:pPr>
         <w:pStyle w:val="Heading2"/>
         <w:bidi/>
       </w:pPr>
       <w:r>
         <w:rPr>
+          <w:rFonts w:ascii="Arial" w:hAnsi="Arial" w:hint="cs"/>
+          <w:rtl/>
+          <w:lang w:bidi="he-IL"/>
+        </w:rPr>
+        <w:t xml:space="preserve">4. </w:t>
+      </w:r>
+      <w:r>
+        <w:rPr>
           <w:rFonts w:ascii="Arial" w:hAnsi="Arial"/>
           <w:rtl/>
         </w:rPr>
-        <w:t>4. הכנת מאגרי הדיבור החופשי</w:t>
+        <w:t>תוצאות וגרפים</w:t>
       </w:r>
     </w:p>
     <w:p>
@@ -663,50 +1526,195 @@
         <w:rPr>
           <w:rtl/>
         </w:rPr>
-        <w:t>הנתונים המקוריים נמצאים תחת:</w:t>
+        <w:t xml:space="preserve">ב-Kaggle </w:t>
+      </w:r>
+      <w:r>
+        <w:rPr>
+          <w:rFonts w:hint="cs"/>
+          <w:rtl/>
+          <w:lang w:bidi="he-IL"/>
+        </w:rPr>
+        <w:t>ה</w:t>
+      </w:r>
+      <w:r>
+        <w:rPr>
+          <w:rtl/>
+        </w:rPr>
+        <w:t>גרפים מוצגים ישירות בפלט של המחברת</w:t>
+      </w:r>
+      <w:r>
+        <w:rPr>
+          <w:rFonts w:hint="cs"/>
+          <w:rtl/>
+          <w:lang w:bidi="he-IL"/>
+        </w:rPr>
+        <w:t xml:space="preserve"> וכן ב-</w:t>
+      </w:r>
+      <w:r>
+        <w:rPr>
+          <w:lang w:bidi="he-IL"/>
+        </w:rPr>
+        <w:t>output</w:t>
+      </w:r>
+      <w:r>
+        <w:rPr>
+          <w:rFonts w:hint="cs"/>
+          <w:rtl/>
+          <w:lang w:bidi="he-IL"/>
+        </w:rPr>
+        <w:t xml:space="preserve"> של המחברת</w:t>
+      </w:r>
+      <w:r>
+        <w:rPr>
+          <w:rtl/>
+        </w:rPr>
+        <w:t>.</w:t>
       </w:r>
     </w:p>
     <w:p>
+      <w:pPr>
+        <w:bidi/>
+      </w:pPr>
+      <w:r>
+        <w:rPr>
+          <w:rtl/>
+        </w:rPr>
+        <w:t>בהרצה מקומית ב-PyCharm הגרפים נשמרים גם תחת:</w:t>
+      </w:r>
+    </w:p>
+    <w:p>
       <w:r>
         <w:rPr>
           <w:rFonts w:ascii="Courier New" w:hAnsi="Courier New"/>
           <w:sz w:val="19"/>
         </w:rPr>
-        <w:t>all_accents_data/</w:t>
+        <w:t>graphs/</w:t>
       </w:r>
     </w:p>
     <w:p>
       <w:pPr>
+        <w:pStyle w:val="Heading2"/>
         <w:bidi/>
-      </w:pPr>
-      <w:r>
-        <w:rPr>
-          <w:rtl/>
-        </w:rPr>
-        <w:t>כדי לאחד את המקורות לפי מבטא מריצים</w:t>
-      </w:r>
-      <w:r>
-        <w:rPr>
-          <w:rFonts w:hint="cs"/>
-          <w:rtl/>
-          <w:lang w:bidi="he-IL"/>
-        </w:rPr>
-        <w:t xml:space="preserve"> את הקובץ הבא (בתיקייה הראשית)</w:t>
-      </w:r>
-      <w:r>
-        <w:rPr>
-          <w:rtl/>
-        </w:rPr>
-        <w:t>:</w:t>
+        <w:rPr>
+          <w:rFonts w:asciiTheme="majorBidi" w:hAnsiTheme="majorBidi"/>
+          <w:rtl/>
+          <w:lang w:bidi="he-IL"/>
+        </w:rPr>
+      </w:pPr>
+      <w:r>
+        <w:rPr>
+          <w:rFonts w:asciiTheme="majorBidi" w:hAnsiTheme="majorBidi"/>
+          <w:lang w:bidi="he-IL"/>
+        </w:rPr>
+        <w:t>5</w:t>
+      </w:r>
+      <w:r>
+        <w:rPr>
+          <w:rFonts w:asciiTheme="majorBidi" w:hAnsiTheme="majorBidi"/>
+          <w:rtl/>
+        </w:rPr>
+        <w:t xml:space="preserve">. </w:t>
+      </w:r>
+      <w:r>
+        <w:rPr>
+          <w:rFonts w:asciiTheme="majorBidi" w:hAnsiTheme="majorBidi"/>
+          <w:rtl/>
+          <w:lang w:bidi="he-IL"/>
+        </w:rPr>
+        <w:t>העלאת הקלט</w:t>
+      </w:r>
+      <w:r>
+        <w:rPr>
+          <w:rFonts w:asciiTheme="majorBidi" w:hAnsiTheme="majorBidi" w:hint="cs"/>
+          <w:rtl/>
+          <w:lang w:bidi="he-IL"/>
+        </w:rPr>
+        <w:t xml:space="preserve"> וקבלת חיזוי</w:t>
       </w:r>
     </w:p>
     <w:p>
-      <w:r>
-        <w:rPr>
-          <w:rFonts w:ascii="Courier New" w:hAnsi="Courier New"/>
-          <w:sz w:val="19"/>
-        </w:rPr>
-        <w:t>group_sources_to_one_by_accent.py</w:t>
+      <w:pPr>
+        <w:bidi/>
+        <w:rPr>
+          <w:rtl/>
+          <w:lang w:bidi="he-IL"/>
+        </w:rPr>
+      </w:pPr>
+      <w:r>
+        <w:rPr>
+          <w:rFonts w:hint="cs"/>
+          <w:rtl/>
+          <w:lang w:bidi="he-IL"/>
+        </w:rPr>
+        <w:t xml:space="preserve">בניסויים  </w:t>
+      </w:r>
+      <w:r>
+        <w:rPr>
+          <w:rFonts w:hint="cs"/>
+          <w:rtl/>
+          <w:lang w:bidi="he-IL"/>
+        </w:rPr>
+        <w:t>3.1, 3.</w:t>
+      </w:r>
+      <w:r>
+        <w:rPr>
+          <w:rFonts w:hint="cs"/>
+          <w:rtl/>
+          <w:lang w:bidi="he-IL"/>
+        </w:rPr>
+        <w:t>3</w:t>
+      </w:r>
+      <w:r>
+        <w:rPr>
+          <w:rFonts w:hint="cs"/>
+          <w:rtl/>
+          <w:lang w:bidi="he-IL"/>
+        </w:rPr>
+        <w:t xml:space="preserve"> ,3.4</w:t>
+      </w:r>
+      <w:r>
+        <w:rPr>
+          <w:rFonts w:hint="cs"/>
+          <w:rtl/>
+          <w:lang w:bidi="he-IL"/>
+        </w:rPr>
+        <w:t xml:space="preserve"> בסיום ההרצה תינתן למשתמש אפשרות להעלות קובץ אודיו בפורמט </w:t>
+      </w:r>
+      <w:r>
+        <w:rPr>
+          <w:lang w:bidi="he-IL"/>
+        </w:rPr>
+        <w:t>wav</w:t>
+      </w:r>
+      <w:r>
+        <w:rPr>
+          <w:rFonts w:hint="cs"/>
+          <w:rtl/>
+          <w:lang w:bidi="he-IL"/>
+        </w:rPr>
+        <w:t xml:space="preserve"> או </w:t>
+      </w:r>
+      <w:r>
+        <w:rPr>
+          <w:lang w:bidi="he-IL"/>
+        </w:rPr>
+        <w:t xml:space="preserve">MP3 </w:t>
+      </w:r>
+      <w:r>
+        <w:rPr>
+          <w:rFonts w:hint="cs"/>
+          <w:rtl/>
+          <w:lang w:bidi="he-IL"/>
+        </w:rPr>
+        <w:t xml:space="preserve"> לצורך קבלת </w:t>
+      </w:r>
+      <w:r>
+        <w:rPr>
+          <w:rFonts w:hint="cs"/>
+          <w:rtl/>
+          <w:lang w:bidi="he-IL"/>
+        </w:rPr>
+        <w:t xml:space="preserve">פלט . </w:t>
       </w:r>
     </w:p>
     <w:p>
@@ -719,142 +1727,343 @@
       </w:pPr>
       <w:r>
         <w:rPr>
-          <w:rtl/>
-        </w:rPr>
-        <w:t>הפלט נשמר תחת:</w:t>
+          <w:rFonts w:hint="cs"/>
+          <w:rtl/>
+          <w:lang w:bidi="he-IL"/>
+        </w:rPr>
+        <w:t xml:space="preserve">ב- </w:t>
+      </w:r>
+      <w:r>
+        <w:rPr>
+          <w:lang w:bidi="he-IL"/>
+        </w:rPr>
+        <w:t>pycharm</w:t>
+      </w:r>
+      <w:r>
+        <w:rPr>
+          <w:rFonts w:hint="cs"/>
+          <w:rtl/>
+          <w:lang w:bidi="he-IL"/>
+        </w:rPr>
+        <w:t xml:space="preserve"> יקפוץ חלון שיאפשר להעלות את הקלט ו</w:t>
+      </w:r>
+      <w:r>
+        <w:rPr>
+          <w:rFonts w:hint="cs"/>
+          <w:rtl/>
+          <w:lang w:bidi="he-IL"/>
+        </w:rPr>
+        <w:t xml:space="preserve">אילו </w:t>
+      </w:r>
+      <w:r>
+        <w:rPr>
+          <w:rFonts w:hint="cs"/>
+          <w:rtl/>
+          <w:lang w:bidi="he-IL"/>
+        </w:rPr>
+        <w:t>ב</w:t>
+      </w:r>
+      <w:r>
+        <w:rPr>
+          <w:rFonts w:hint="cs"/>
+          <w:rtl/>
+          <w:lang w:bidi="he-IL"/>
+        </w:rPr>
+        <w:t>הרצת מחברת הניסוי בסביבת</w:t>
+      </w:r>
+      <w:r>
+        <w:rPr>
+          <w:rFonts w:hint="cs"/>
+          <w:rtl/>
+          <w:lang w:bidi="he-IL"/>
+        </w:rPr>
+        <w:t xml:space="preserve"> </w:t>
+      </w:r>
+      <w:r>
+        <w:rPr>
+          <w:lang w:bidi="he-IL"/>
+        </w:rPr>
+        <w:t>kaggle</w:t>
+      </w:r>
+      <w:r>
+        <w:rPr>
+          <w:rFonts w:hint="cs"/>
+          <w:rtl/>
+          <w:lang w:bidi="he-IL"/>
+        </w:rPr>
+        <w:t xml:space="preserve"> </w:t>
+      </w:r>
+      <w:r>
+        <w:rPr>
+          <w:rFonts w:hint="cs"/>
+          <w:rtl/>
+          <w:lang w:bidi="he-IL"/>
+        </w:rPr>
+        <w:t xml:space="preserve">יופיע </w:t>
+      </w:r>
+      <w:r>
+        <w:rPr>
+          <w:rFonts w:hint="cs"/>
+          <w:rtl/>
+          <w:lang w:bidi="he-IL"/>
+        </w:rPr>
+        <w:t xml:space="preserve">בבלוק האחרון </w:t>
+      </w:r>
+      <w:r>
+        <w:rPr>
+          <w:rFonts w:hint="cs"/>
+          <w:rtl/>
+          <w:lang w:bidi="he-IL"/>
+        </w:rPr>
+        <w:t>,</w:t>
+      </w:r>
+      <w:r>
+        <w:rPr>
+          <w:rFonts w:hint="cs"/>
+          <w:rtl/>
+          <w:lang w:bidi="he-IL"/>
+        </w:rPr>
+        <w:t xml:space="preserve">הקלט </w:t>
+      </w:r>
+      <w:r>
+        <w:rPr>
+          <w:rFonts w:hint="cs"/>
+          <w:rtl/>
+          <w:lang w:bidi="he-IL"/>
+        </w:rPr>
+        <w:t>הבא</w:t>
+      </w:r>
+      <w:r>
+        <w:rPr>
+          <w:rFonts w:hint="cs"/>
+          <w:rtl/>
+          <w:lang w:bidi="he-IL"/>
+        </w:rPr>
+        <w:t xml:space="preserve"> :</w:t>
       </w:r>
     </w:p>
     <w:p>
-      <w:r>
-        <w:rPr>
-          <w:rFonts w:ascii="Courier New" w:hAnsi="Courier New"/>
-          <w:sz w:val="19"/>
-        </w:rPr>
-        <w:t>audio_by_accent_raw/</w:t>
+      <w:pPr>
+        <w:bidi/>
+        <w:rPr>
+          <w:rtl/>
+          <w:lang w:bidi="he-IL"/>
+        </w:rPr>
+      </w:pPr>
+      <w:r>
+        <w:rPr>
+          <w:rFonts w:cs="Arial"/>
+          <w:noProof/>
+          <w:rtl/>
+          <w:lang w:bidi="he-IL"/>
+        </w:rPr>
+        <w:drawing>
+          <wp:anchor distT="0" distB="0" distL="114300" distR="114300" simplePos="0" relativeHeight="251659264" behindDoc="1" locked="0" layoutInCell="1" allowOverlap="1" wp14:anchorId="774A2E19" wp14:editId="73D761E0">
+            <wp:simplePos x="0" y="0"/>
+            <wp:positionH relativeFrom="column">
+              <wp:posOffset>0</wp:posOffset>
+            </wp:positionH>
+            <wp:positionV relativeFrom="paragraph">
+              <wp:posOffset>0</wp:posOffset>
+            </wp:positionV>
+            <wp:extent cx="6188710" cy="645160"/>
+            <wp:effectExtent l="0" t="0" r="2540" b="2540"/>
+            <wp:wrapNone/>
+            <wp:docPr id="1872901823" name="Picture 1"/>
+            <wp:cNvGraphicFramePr>
+              <a:graphicFrameLocks xmlns:a="http://schemas.openxmlformats.org/drawingml/2006/main" noChangeAspect="1"/>
+            </wp:cNvGraphicFramePr>
+            <a:graphic xmlns:a="http://schemas.openxmlformats.org/drawingml/2006/main">
+              <a:graphicData uri="http://schemas.openxmlformats.org/drawingml/2006/picture">
+                <pic:pic xmlns:pic="http://schemas.openxmlformats.org/drawingml/2006/picture">
+                  <pic:nvPicPr>
+                    <pic:cNvPr id="1872901823" name=""/>
+                    <pic:cNvPicPr/>
+                  </pic:nvPicPr>
+                  <pic:blipFill>
+                    <a:blip r:embed="rId7"/>
+                    <a:stretch>
+                      <a:fillRect/>
+                    </a:stretch>
+                  </pic:blipFill>
+                  <pic:spPr>
+                    <a:xfrm>
+                      <a:off x="0" y="0"/>
+                      <a:ext cx="6188710" cy="645160"/>
+                    </a:xfrm>
+                    <a:prstGeom prst="rect">
+                      <a:avLst/>
+                    </a:prstGeom>
+                  </pic:spPr>
+                </pic:pic>
+              </a:graphicData>
+            </a:graphic>
+          </wp:anchor>
+        </w:drawing>
       </w:r>
     </w:p>
     <w:p>
       <w:pPr>
-        <w:pStyle w:val="Heading2"/>
-        <w:bidi/>
-        <w:rPr>
-          <w:rFonts w:asciiTheme="majorBidi" w:hAnsiTheme="majorBidi"/>
-          <w:lang w:bidi="he-IL"/>
-        </w:rPr>
-      </w:pPr>
-      <w:r>
-        <w:rPr>
-          <w:rFonts w:ascii="Arial" w:hAnsi="Arial"/>
-          <w:rtl/>
-        </w:rPr>
-        <w:t xml:space="preserve">5. </w:t>
-      </w:r>
-      <w:r>
-        <w:rPr>
-          <w:rFonts w:asciiTheme="majorBidi" w:hAnsiTheme="majorBidi"/>
-          <w:rtl/>
-        </w:rPr>
-        <w:t>חיתוך מאגר</w:t>
-      </w:r>
-      <w:r>
-        <w:rPr>
-          <w:rFonts w:asciiTheme="majorBidi" w:hAnsiTheme="majorBidi"/>
-          <w:rtl/>
-          <w:lang w:bidi="he-IL"/>
-        </w:rPr>
-        <w:t xml:space="preserve"> </w:t>
-      </w:r>
-      <w:r>
-        <w:rPr>
-          <w:rFonts w:asciiTheme="majorBidi" w:hAnsiTheme="majorBidi"/>
-          <w:lang w:bidi="he-IL"/>
-        </w:rPr>
-        <w:t>speech accent archive</w:t>
-      </w:r>
+        <w:jc w:val="right"/>
+      </w:pPr>
     </w:p>
     <w:p>
       <w:pPr>
+        <w:tabs>
+          <w:tab w:val="left" w:pos="8009"/>
+        </w:tabs>
         <w:bidi/>
-        <w:rPr>
-          <w:rtl/>
-          <w:lang w:bidi="he-IL"/>
-        </w:rPr>
-      </w:pPr>
-      <w:r>
-        <w:rPr>
-          <w:rtl/>
-        </w:rPr>
-        <w:t xml:space="preserve">החיתוך מתבצע בעזרת </w:t>
-      </w:r>
-      <w:r>
+        <w:spacing w:after="160"/>
         <w:rPr>
           <w:rFonts w:hint="cs"/>
           <w:rtl/>
           <w:lang w:bidi="he-IL"/>
         </w:rPr>
-        <w:t>הקובץ הבא</w:t>
-      </w:r>
-      <w:r>
-        <w:rPr>
-          <w:rtl/>
-        </w:rPr>
-        <w:t xml:space="preserve"> שבתיקיית:</w:t>
+      </w:pPr>
+      <w:r>
+        <w:rPr>
+          <w:noProof/>
+        </w:rPr>
+        <w:drawing>
+          <wp:anchor distT="0" distB="0" distL="114300" distR="114300" simplePos="0" relativeHeight="251658752" behindDoc="1" locked="0" layoutInCell="1" allowOverlap="1" wp14:anchorId="24AD0E5F" wp14:editId="1E0D20E4">
+            <wp:simplePos x="0" y="0"/>
+            <wp:positionH relativeFrom="column">
+              <wp:posOffset>61448</wp:posOffset>
+            </wp:positionH>
+            <wp:positionV relativeFrom="paragraph">
+              <wp:posOffset>555186</wp:posOffset>
+            </wp:positionV>
+            <wp:extent cx="5258256" cy="1577477"/>
+            <wp:effectExtent l="0" t="0" r="0" b="3810"/>
+            <wp:wrapNone/>
+            <wp:docPr id="1156712470" name="Picture 1"/>
+            <wp:cNvGraphicFramePr>
+              <a:graphicFrameLocks xmlns:a="http://schemas.openxmlformats.org/drawingml/2006/main" noChangeAspect="1"/>
+            </wp:cNvGraphicFramePr>
+            <a:graphic xmlns:a="http://schemas.openxmlformats.org/drawingml/2006/main">
+              <a:graphicData uri="http://schemas.openxmlformats.org/drawingml/2006/picture">
+                <pic:pic xmlns:pic="http://schemas.openxmlformats.org/drawingml/2006/picture">
+                  <pic:nvPicPr>
+                    <pic:cNvPr id="1156712470" name=""/>
+                    <pic:cNvPicPr/>
+                  </pic:nvPicPr>
+                  <pic:blipFill>
+                    <a:blip r:embed="rId8"/>
+                    <a:stretch>
+                      <a:fillRect/>
+                    </a:stretch>
+                  </pic:blipFill>
+                  <pic:spPr>
+                    <a:xfrm>
+                      <a:off x="0" y="0"/>
+                      <a:ext cx="5258256" cy="1577477"/>
+                    </a:xfrm>
+                    <a:prstGeom prst="rect">
+                      <a:avLst/>
+                    </a:prstGeom>
+                  </pic:spPr>
+                </pic:pic>
+              </a:graphicData>
+            </a:graphic>
+          </wp:anchor>
+        </w:drawing>
+      </w:r>
+      <w:r>
+        <w:rPr>
+          <w:rFonts w:hint="cs"/>
+          <w:rtl/>
+          <w:lang w:bidi="he-IL"/>
+        </w:rPr>
+        <w:t>לאחר זמן עיבוד</w:t>
+      </w:r>
+      <w:r>
+        <w:rPr>
+          <w:rFonts w:hint="cs"/>
+          <w:rtl/>
+          <w:lang w:bidi="he-IL"/>
+        </w:rPr>
+        <w:t xml:space="preserve"> וניתוח</w:t>
+      </w:r>
+      <w:r>
+        <w:rPr>
+          <w:rFonts w:hint="cs"/>
+          <w:rtl/>
+          <w:lang w:bidi="he-IL"/>
+        </w:rPr>
+        <w:t xml:space="preserve"> ,</w:t>
+      </w:r>
+      <w:r>
+        <w:t xml:space="preserve">התוכנה </w:t>
+      </w:r>
+      <w:r>
+        <w:rPr>
+          <w:rFonts w:hint="cs"/>
+          <w:rtl/>
+          <w:lang w:bidi="he-IL"/>
+        </w:rPr>
+        <w:t xml:space="preserve"> תציג </w:t>
+      </w:r>
+      <w:r>
+        <w:t xml:space="preserve"> את המבטא שחזה המסווג, </w:t>
+      </w:r>
+      <w:r>
+        <w:rPr>
+          <w:rFonts w:hint="cs"/>
+        </w:rPr>
+        <w:t>ו</w:t>
+      </w:r>
+      <w:r>
+        <w:t xml:space="preserve">גם את </w:t>
+      </w:r>
+      <w:r>
+        <w:rPr>
+          <w:rFonts w:hint="cs"/>
+        </w:rPr>
+        <w:t>אחוז השייכות של האודיו ל</w:t>
+      </w:r>
+      <w:r>
+        <w:t>כל אחת מארבע קבוצות המבטא</w:t>
+      </w:r>
+      <w:r>
+        <w:rPr>
+          <w:rFonts w:hint="cs"/>
+          <w:rtl/>
+          <w:lang w:bidi="he-IL"/>
+        </w:rPr>
+        <w:t xml:space="preserve"> ,לדוגמא :</w:t>
       </w:r>
     </w:p>
     <w:p>
-      <w:r>
-        <w:rPr>
-          <w:rFonts w:ascii="Courier New" w:hAnsi="Courier New"/>
-          <w:sz w:val="19"/>
-        </w:rPr>
-        <w:t>cut_and_normalize/</w:t>
-      </w:r>
-      <w:r>
-        <w:rPr>
-          <w:rFonts w:ascii="Courier New" w:hAnsi="Courier New"/>
-          <w:sz w:val="19"/>
-        </w:rPr>
-        <w:t>cut_archive_to_sentences.py</w:t>
-      </w:r>
+      <w:pPr>
+        <w:jc w:val="right"/>
+        <w:rPr>
+          <w:lang w:bidi="he-IL"/>
+        </w:rPr>
+      </w:pPr>
     </w:p>
     <w:p>
       <w:pPr>
-        <w:bidi/>
-      </w:pPr>
-      <w:r>
-        <w:rPr>
-          <w:rtl/>
-        </w:rPr>
-        <w:t>התהליך נעזר ב-Whisper כדי לחלק את ההקלטה לששת המשפטים. הפלט נשמר תחת:</w:t>
-      </w:r>
+        <w:rPr>
+          <w:lang w:bidi="he-IL"/>
+        </w:rPr>
+      </w:pPr>
     </w:p>
     <w:p>
-      <w:r>
-        <w:rPr>
-          <w:rFonts w:ascii="Courier New" w:hAnsi="Courier New"/>
-          <w:sz w:val="19"/>
-        </w:rPr>
-        <w:t>sentences_samples/</w:t>
-      </w:r>
+      <w:pPr>
+        <w:rPr>
+          <w:lang w:bidi="he-IL"/>
+        </w:rPr>
+      </w:pPr>
     </w:p>
     <w:p>
       <w:pPr>
-        <w:bidi/>
-        <w:rPr>
-          <w:rtl/>
-          <w:lang w:bidi="he-IL"/>
-        </w:rPr>
-      </w:pPr>
-      <w:r>
-        <w:rPr>
-          <w:rtl/>
-        </w:rPr>
-        <w:t>ובתוך כל מבטא קיימת תיקייה נפרדת לכל משפט.</w:t>
-      </w:r>
+        <w:rPr>
+          <w:lang w:bidi="he-IL"/>
+        </w:rPr>
+      </w:pPr>
     </w:p>
     <w:p>
       <w:pPr>
-        <w:bidi/>
         <w:rPr>
           <w:lang w:bidi="he-IL"/>
         </w:rPr>
@@ -862,865 +2071,74 @@
     </w:p>
     <w:p>
       <w:pPr>
-        <w:pStyle w:val="Heading2"/>
-        <w:bidi/>
-      </w:pPr>
-      <w:r>
-        <w:rPr>
-          <w:rFonts w:ascii="Arial" w:hAnsi="Arial"/>
-          <w:rtl/>
-        </w:rPr>
-        <w:lastRenderedPageBreak/>
-        <w:t>6. יצירת קובצי המטא-דאטה</w:t>
-      </w:r>
+        <w:rPr>
+          <w:lang w:bidi="he-IL"/>
+        </w:rPr>
+      </w:pPr>
     </w:p>
     <w:p>
       <w:pPr>
         <w:bidi/>
-      </w:pPr>
-      <w:r>
-        <w:rPr>
-          <w:rtl/>
-        </w:rPr>
-        <w:t>מריצים:</w:t>
+        <w:rPr>
+          <w:rFonts w:hint="cs"/>
+          <w:rtl/>
+          <w:lang w:bidi="he-IL"/>
+        </w:rPr>
+      </w:pPr>
+      <w:r>
+        <w:rPr>
+          <w:sz w:val="21"/>
+        </w:rPr>
+        <w:t xml:space="preserve"> </w:t>
+      </w:r>
+      <w:r>
+        <w:rPr>
+          <w:sz w:val="21"/>
+        </w:rPr>
+        <w:t xml:space="preserve"> </w:t>
+      </w:r>
+      <w:r>
+        <w:rPr>
+          <w:sz w:val="21"/>
+        </w:rPr>
+        <w:t>לשחזור מדויק יותר של הניסויים וההגדרות יש להיעזר</w:t>
+      </w:r>
+      <w:r>
+        <w:rPr>
+          <w:sz w:val="21"/>
+        </w:rPr>
+        <w:t xml:space="preserve"> </w:t>
+      </w:r>
+      <w:r>
+        <w:rPr>
+          <w:sz w:val="21"/>
+        </w:rPr>
+        <w:t xml:space="preserve"> </w:t>
+      </w:r>
+      <w:r>
+        <w:rPr>
+          <w:rFonts w:hint="cs"/>
+          <w:rtl/>
+          <w:lang w:bidi="he-IL"/>
+        </w:rPr>
+        <w:t xml:space="preserve">במסמך </w:t>
+      </w:r>
+      <w:r>
+        <w:rPr>
+          <w:sz w:val="21"/>
+        </w:rPr>
+        <w:t>EXPERIMENT_REPRODUCTION_GUIDE.docx</w:t>
       </w:r>
     </w:p>
     <w:p>
-      <w:r>
-        <w:rPr>
-          <w:rFonts w:ascii="Courier New" w:hAnsi="Courier New"/>
-          <w:sz w:val="19"/>
-        </w:rPr>
-        <w:t>metadata_generator.py</w:t>
-      </w:r>
+      <w:pPr>
+        <w:jc w:val="right"/>
+        <w:rPr>
+          <w:rtl/>
+          <w:lang w:bidi="he-IL"/>
+        </w:rPr>
+      </w:pPr>
     </w:p>
-    <w:p>
-      <w:pPr>
-        <w:bidi/>
-      </w:pPr>
-      <w:r>
-        <w:rPr>
-          <w:rtl/>
-        </w:rPr>
-        <w:t>נוצרים קובצי metadata</w:t>
-      </w:r>
-      <w:r>
-        <w:rPr>
-          <w:rFonts w:hint="cs"/>
-          <w:rtl/>
-          <w:lang w:bidi="he-IL"/>
-        </w:rPr>
-        <w:t xml:space="preserve"> בשם </w:t>
-      </w:r>
-      <w:r>
-        <w:rPr>
-          <w:rFonts w:ascii="Courier New" w:hAnsi="Courier New"/>
-          <w:sz w:val="19"/>
-        </w:rPr>
-        <w:t>massive_metadata_&lt;mode&gt;.csv</w:t>
-      </w:r>
-      <w:r>
-        <w:rPr>
-          <w:rFonts w:hint="cs"/>
-          <w:rtl/>
-          <w:lang w:bidi="he-IL"/>
-        </w:rPr>
-        <w:t xml:space="preserve"> </w:t>
-      </w:r>
-      <w:r>
-        <w:rPr>
-          <w:rtl/>
-        </w:rPr>
-        <w:t>עבור</w:t>
-      </w:r>
-      <w:r>
-        <w:rPr>
-          <w:rFonts w:hint="cs"/>
-          <w:rtl/>
-          <w:lang w:bidi="he-IL"/>
-        </w:rPr>
-        <w:t xml:space="preserve"> המאגרים</w:t>
-      </w:r>
-      <w:r>
-        <w:rPr>
-          <w:rtl/>
-        </w:rPr>
-        <w:t>:</w:t>
-      </w:r>
-    </w:p>
-    <w:p>
-      <w:r>
-        <w:rPr>
-          <w:rFonts w:ascii="Courier New" w:hAnsi="Courier New"/>
-          <w:sz w:val="19"/>
-        </w:rPr>
-        <w:t>archive_only</w:t>
-      </w:r>
-    </w:p>
-    <w:p>
-      <w:r>
-        <w:rPr>
-          <w:rFonts w:ascii="Courier New" w:hAnsi="Courier New"/>
-          <w:sz w:val="19"/>
-        </w:rPr>
-        <w:t>free_text</w:t>
-      </w:r>
-    </w:p>
-    <w:p>
-      <w:r>
-        <w:rPr>
-          <w:rFonts w:ascii="Courier New" w:hAnsi="Courier New"/>
-          <w:sz w:val="19"/>
-        </w:rPr>
-        <w:t>mixed</w:t>
-      </w:r>
-    </w:p>
-    <w:p>
-      <w:pPr>
-        <w:bidi/>
-        <w:rPr>
-          <w:lang w:bidi="he-IL"/>
-        </w:rPr>
-      </w:pPr>
-      <w:r>
-        <w:rPr>
-          <w:rFonts w:hint="cs"/>
-          <w:rtl/>
-          <w:lang w:bidi="he-IL"/>
-        </w:rPr>
-        <w:t>קובץ המטא דאטה</w:t>
-      </w:r>
-      <w:r>
-        <w:rPr>
-          <w:rFonts w:hint="cs"/>
-          <w:rtl/>
-          <w:lang w:bidi="he-IL"/>
-        </w:rPr>
-        <w:t xml:space="preserve"> </w:t>
-      </w:r>
-      <w:r>
-        <w:rPr>
-          <w:rFonts w:hint="cs"/>
-          <w:rtl/>
-          <w:lang w:bidi="he-IL"/>
-        </w:rPr>
-        <w:t xml:space="preserve">של כל מאגר נשמר תחת תיקיית </w:t>
-      </w:r>
-      <w:r>
-        <w:rPr>
-          <w:rFonts w:ascii="Courier New" w:hAnsi="Courier New"/>
-          <w:sz w:val="19"/>
-        </w:rPr>
-        <w:t>machine_learning_official</w:t>
-      </w:r>
-      <w:r>
-        <w:rPr>
-          <w:lang w:bidi="he-IL"/>
-        </w:rPr>
-        <w:t xml:space="preserve"> _</w:t>
-      </w:r>
-      <w:r>
-        <w:rPr>
-          <w:rFonts w:ascii="Courier New" w:hAnsi="Courier New"/>
-          <w:sz w:val="19"/>
-        </w:rPr>
-        <w:t>_&lt;mode&gt;/</w:t>
-      </w:r>
-      <w:r>
-        <w:rPr>
-          <w:rFonts w:hint="cs"/>
-          <w:rtl/>
-          <w:lang w:bidi="he-IL"/>
-        </w:rPr>
-        <w:t xml:space="preserve"> בהתאמה.</w:t>
-      </w:r>
-    </w:p>
-    <w:p>
-      <w:pPr>
-        <w:pStyle w:val="Heading2"/>
-        <w:bidi/>
-      </w:pPr>
-      <w:r>
-        <w:rPr>
-          <w:rFonts w:ascii="Arial" w:hAnsi="Arial"/>
-          <w:rtl/>
-        </w:rPr>
-        <w:t>7. נרמול ויצירת פיצ'רים</w:t>
-      </w:r>
-    </w:p>
-    <w:p>
-      <w:pPr>
-        <w:bidi/>
-      </w:pPr>
-      <w:r>
-        <w:rPr>
-          <w:rtl/>
-        </w:rPr>
-        <w:t>למסלול הפיצ'רים מריצים תחילה:</w:t>
-      </w:r>
-    </w:p>
-    <w:p>
-      <w:r>
-        <w:rPr>
-          <w:rFonts w:ascii="Courier New" w:hAnsi="Courier New"/>
-          <w:sz w:val="19"/>
-        </w:rPr>
-        <w:t>cut_and_normalize/normalize_all_for_2_folders.py</w:t>
-      </w:r>
-    </w:p>
-    <w:p>
-      <w:pPr>
-        <w:bidi/>
-      </w:pPr>
-      <w:r>
-        <w:rPr>
-          <w:rtl/>
-        </w:rPr>
-        <w:t>הפלט נשמר ב:</w:t>
-      </w:r>
-    </w:p>
-    <w:p>
-      <w:r>
-        <w:rPr>
-          <w:rFonts w:ascii="Courier New" w:hAnsi="Courier New"/>
-          <w:sz w:val="19"/>
-        </w:rPr>
-        <w:t>audio_by_accent_raw_normalized/</w:t>
-      </w:r>
-    </w:p>
-    <w:p>
-      <w:r>
-        <w:rPr>
-          <w:rFonts w:ascii="Courier New" w:hAnsi="Courier New"/>
-          <w:sz w:val="19"/>
-        </w:rPr>
-        <w:t>sentences_samples_normalized/</w:t>
-      </w:r>
-    </w:p>
-    <w:p>
-      <w:pPr>
-        <w:bidi/>
-      </w:pPr>
-      <w:r>
-        <w:rPr>
-          <w:rtl/>
-        </w:rPr>
-        <w:t>לאחר מכן מריצים את השלב המשותף:</w:t>
-      </w:r>
-    </w:p>
-    <w:p>
-      <w:r>
-        <w:rPr>
-          <w:rFonts w:ascii="Courier New" w:hAnsi="Courier New"/>
-          <w:sz w:val="19"/>
-        </w:rPr>
-        <w:t>create_features.py</w:t>
-      </w:r>
-    </w:p>
-    <w:p>
-      <w:pPr>
-        <w:bidi/>
-      </w:pPr>
-      <w:r>
-        <w:rPr>
-          <w:rtl/>
-        </w:rPr>
-        <w:t>נוצרים:</w:t>
-      </w:r>
-    </w:p>
-    <w:p>
-      <w:r>
-        <w:rPr>
-          <w:rFonts w:ascii="Courier New" w:hAnsi="Courier New"/>
-          <w:sz w:val="19"/>
-        </w:rPr>
-        <w:t>master_extracted_features_archive_only.csv</w:t>
-      </w:r>
-    </w:p>
-    <w:p>
-      <w:r>
-        <w:rPr>
-          <w:rFonts w:ascii="Courier New" w:hAnsi="Courier New"/>
-          <w:sz w:val="19"/>
-        </w:rPr>
-        <w:t>master_extracted_features_free_text.csv</w:t>
-      </w:r>
-    </w:p>
-    <w:p>
-      <w:r>
-        <w:rPr>
-          <w:rFonts w:ascii="Courier New" w:hAnsi="Courier New"/>
-          <w:sz w:val="19"/>
-        </w:rPr>
-        <w:t>master_extracted_features_mixed.csv</w:t>
-      </w:r>
-    </w:p>
-    <w:p>
-      <w:pPr>
-        <w:bidi/>
-      </w:pPr>
-      <w:r>
-        <w:rPr>
-          <w:rtl/>
-        </w:rPr>
-        <w:t>קבצים אלה משמשים את מסלול Machine Learning, והפיצ'רים הרלוונטיים משמשים גם את Multimodal CNN.</w:t>
-      </w:r>
-    </w:p>
-    <w:p>
-      <w:pPr>
-        <w:pStyle w:val="Heading2"/>
-        <w:bidi/>
-      </w:pPr>
-      <w:r>
-        <w:rPr>
-          <w:rFonts w:ascii="Arial" w:hAnsi="Arial" w:hint="cs"/>
-          <w:rtl/>
-          <w:lang w:bidi="he-IL"/>
-        </w:rPr>
-        <w:t>8</w:t>
-      </w:r>
-      <w:r>
-        <w:rPr>
-          <w:rFonts w:ascii="Arial" w:hAnsi="Arial"/>
-          <w:rtl/>
-        </w:rPr>
-        <w:t>. הרצת מסווגי למידת מכונה</w:t>
-      </w:r>
-    </w:p>
-    <w:p>
-      <w:pPr>
-        <w:bidi/>
-      </w:pPr>
-      <w:r>
-        <w:rPr>
-          <w:rtl/>
-        </w:rPr>
-        <w:t>פותחים את:</w:t>
-      </w:r>
-    </w:p>
-    <w:p>
-      <w:r>
-        <w:rPr>
-          <w:rFonts w:ascii="Courier New" w:hAnsi="Courier New"/>
-          <w:sz w:val="19"/>
-        </w:rPr>
-        <w:t>main_for_machine_learning.py</w:t>
-      </w:r>
-    </w:p>
-    <w:p>
-      <w:pPr>
-        <w:bidi/>
-      </w:pPr>
-      <w:r>
-        <w:rPr>
-          <w:rtl/>
-        </w:rPr>
-        <w:t>ובוחרים את מצב הנתונים:</w:t>
-      </w:r>
-    </w:p>
-    <w:p>
-      <w:r>
-        <w:rPr>
-          <w:rFonts w:ascii="Courier New" w:hAnsi="Courier New"/>
-          <w:sz w:val="19"/>
-        </w:rPr>
-        <w:t>RUN_MODE = "free_text"</w:t>
-      </w:r>
-    </w:p>
-    <w:p>
-      <w:pPr>
-        <w:bidi/>
-      </w:pPr>
-      <w:r>
-        <w:rPr>
-          <w:rtl/>
-        </w:rPr>
-        <w:t>אפשר להפעיל בחירת פיצ'רים ולקבוע את מספר הפיצ'רים:</w:t>
-      </w:r>
-    </w:p>
-    <w:p>
-      <w:r>
-        <w:rPr>
-          <w:rFonts w:ascii="Courier New" w:hAnsi="Courier New"/>
-          <w:sz w:val="19"/>
-        </w:rPr>
-        <w:t>ENABLE_FEATURE_SELECTION = False</w:t>
-      </w:r>
-    </w:p>
-    <w:p>
-      <w:r>
-        <w:rPr>
-          <w:rFonts w:ascii="Courier New" w:hAnsi="Courier New"/>
-          <w:sz w:val="19"/>
-        </w:rPr>
-        <w:t>TOP_K_FEATURES = 30</w:t>
-      </w:r>
-    </w:p>
-    <w:p>
-      <w:pPr>
-        <w:bidi/>
-      </w:pPr>
-      <w:r>
-        <w:rPr>
-          <w:rtl/>
-        </w:rPr>
-        <w:t>מצב כוונון ההיפר-פרמטרים נקבע באמצעות:</w:t>
-      </w:r>
-    </w:p>
-    <w:p>
-      <w:r>
-        <w:rPr>
-          <w:rFonts w:ascii="Courier New" w:hAnsi="Courier New"/>
-          <w:sz w:val="19"/>
-        </w:rPr>
-        <w:lastRenderedPageBreak/>
-        <w:t>TUNING_MODE = "random_search"</w:t>
-      </w:r>
-    </w:p>
-    <w:p>
-      <w:pPr>
-        <w:bidi/>
-      </w:pPr>
-      <w:r>
-        <w:rPr>
-          <w:rtl/>
-        </w:rPr>
-        <w:t>לאחר בחירת ההגדרות מריצים את הקובץ.</w:t>
-      </w:r>
-    </w:p>
-    <w:p>
-      <w:pPr>
-        <w:pStyle w:val="Heading2"/>
-        <w:bidi/>
-      </w:pPr>
-      <w:r>
-        <w:rPr>
-          <w:rFonts w:ascii="Arial" w:hAnsi="Arial"/>
-          <w:rtl/>
-        </w:rPr>
-        <w:t>9. יצירת ספקטרוגרמות</w:t>
-      </w:r>
-    </w:p>
-    <w:p>
-      <w:pPr>
-        <w:bidi/>
-      </w:pPr>
-      <w:r>
-        <w:rPr>
-          <w:rtl/>
-        </w:rPr>
-        <w:t>מריצים:</w:t>
-      </w:r>
-    </w:p>
-    <w:p>
-      <w:r>
-        <w:rPr>
-          <w:rFonts w:ascii="Courier New" w:hAnsi="Courier New"/>
-          <w:sz w:val="19"/>
-        </w:rPr>
-        <w:t>cut_and_normalize/spectogram_creation.py</w:t>
-      </w:r>
-    </w:p>
-    <w:p>
-      <w:pPr>
-        <w:bidi/>
-      </w:pPr>
-      <w:r>
-        <w:rPr>
-          <w:rtl/>
-        </w:rPr>
-        <w:t>הפלט נשמר בתיקייה המתאימה למצב הנתונים:</w:t>
-      </w:r>
-    </w:p>
-    <w:p>
-      <w:r>
-        <w:rPr>
-          <w:rFonts w:ascii="Courier New" w:hAnsi="Courier New"/>
-          <w:sz w:val="19"/>
-        </w:rPr>
-        <w:t>spectogram_logmel_&lt;mode&gt;/</w:t>
-      </w:r>
-    </w:p>
-    <w:p>
-      <w:pPr>
-        <w:pStyle w:val="Heading2"/>
-        <w:bidi/>
-        <w:rPr>
-          <w:rFonts w:ascii="Arial" w:hAnsi="Arial"/>
-          <w:rtl/>
-          <w:lang w:bidi="he-IL"/>
-        </w:rPr>
-      </w:pPr>
-      <w:r>
-        <w:rPr>
-          <w:rFonts w:ascii="Arial" w:hAnsi="Arial" w:hint="cs"/>
-          <w:rtl/>
-          <w:lang w:bidi="he-IL"/>
-        </w:rPr>
-        <w:t>10</w:t>
-      </w:r>
-      <w:r>
-        <w:rPr>
-          <w:rFonts w:ascii="Arial" w:hAnsi="Arial"/>
-          <w:rtl/>
-        </w:rPr>
-        <w:t xml:space="preserve">. הרצת </w:t>
-      </w:r>
-      <w:r>
-        <w:rPr>
-          <w:rFonts w:ascii="Arial" w:hAnsi="Arial" w:hint="cs"/>
-          <w:rtl/>
-          <w:lang w:bidi="he-IL"/>
-        </w:rPr>
-        <w:t xml:space="preserve">ניסוי השוואת ספקטוגרמות על מאגר </w:t>
-      </w:r>
-      <w:r>
-        <w:rPr>
-          <w:rFonts w:asciiTheme="majorBidi" w:hAnsiTheme="majorBidi"/>
-          <w:lang w:bidi="he-IL"/>
-        </w:rPr>
-        <w:t>archive</w:t>
-      </w:r>
-      <w:r>
-        <w:rPr>
-          <w:rFonts w:ascii="Arial" w:hAnsi="Arial" w:hint="cs"/>
-          <w:rtl/>
-          <w:lang w:bidi="he-IL"/>
-        </w:rPr>
-        <w:t xml:space="preserve"> :</w:t>
-      </w:r>
-    </w:p>
-    <w:p>
-      <w:pPr>
-        <w:bidi/>
-        <w:rPr>
-          <w:rtl/>
-          <w:lang w:bidi="he-IL"/>
-        </w:rPr>
-      </w:pPr>
-    </w:p>
-    <w:p>
-      <w:pPr>
-        <w:rPr>
-          <w:rtl/>
-        </w:rPr>
-      </w:pPr>
-      <w:r>
-        <w:rPr>
-          <w:rFonts w:ascii="Courier New" w:hAnsi="Courier New"/>
-          <w:sz w:val="19"/>
-          <w:lang w:bidi="he-IL"/>
-        </w:rPr>
-        <w:t>archive</w:t>
-      </w:r>
-      <w:r>
-        <w:rPr>
-          <w:rFonts w:ascii="Courier New" w:hAnsi="Courier New"/>
-          <w:sz w:val="19"/>
-        </w:rPr>
-        <w:t>_cnn.py</w:t>
-      </w:r>
-    </w:p>
-    <w:p>
-      <w:pPr>
-        <w:pStyle w:val="Heading2"/>
-        <w:bidi/>
-      </w:pPr>
-      <w:r>
-        <w:rPr>
-          <w:rFonts w:ascii="Arial" w:hAnsi="Arial" w:hint="cs"/>
-          <w:rtl/>
-          <w:lang w:bidi="he-IL"/>
-        </w:rPr>
-        <w:t>11</w:t>
-      </w:r>
-      <w:r>
-        <w:rPr>
-          <w:rFonts w:ascii="Arial" w:hAnsi="Arial"/>
-          <w:rtl/>
-        </w:rPr>
-        <w:t>. הרצת המודל האקוסטי</w:t>
-      </w:r>
-    </w:p>
-    <w:p>
-      <w:pPr>
-        <w:bidi/>
-      </w:pPr>
-      <w:r>
-        <w:rPr>
-          <w:rtl/>
-        </w:rPr>
-        <w:t>למודל האקוסטי מריצים:</w:t>
-      </w:r>
-    </w:p>
-    <w:p>
-      <w:r>
-        <w:rPr>
-          <w:rFonts w:ascii="Courier New" w:hAnsi="Courier New"/>
-          <w:sz w:val="19"/>
-        </w:rPr>
-        <w:t>main_cnn.py</w:t>
-      </w:r>
-    </w:p>
-    <w:p>
-      <w:pPr>
-        <w:bidi/>
-      </w:pPr>
-      <w:r>
-        <w:rPr>
-          <w:rtl/>
-        </w:rPr>
-        <w:t>המודל משתמש בספקטרוגרמות של מצב הנתונים שנבחר.</w:t>
-      </w:r>
-    </w:p>
-    <w:p>
-      <w:pPr>
-        <w:pStyle w:val="Heading2"/>
-        <w:bidi/>
-      </w:pPr>
-      <w:r>
-        <w:rPr>
-          <w:rFonts w:ascii="Arial" w:hAnsi="Arial" w:hint="cs"/>
-          <w:rtl/>
-          <w:lang w:bidi="he-IL"/>
-        </w:rPr>
-        <w:t>1</w:t>
-      </w:r>
-      <w:r>
-        <w:rPr>
-          <w:rFonts w:ascii="Arial" w:hAnsi="Arial" w:hint="cs"/>
-          <w:rtl/>
-          <w:lang w:bidi="he-IL"/>
-        </w:rPr>
-        <w:t>2</w:t>
-      </w:r>
-      <w:r>
-        <w:rPr>
-          <w:rFonts w:ascii="Arial" w:hAnsi="Arial"/>
-          <w:rtl/>
-        </w:rPr>
-        <w:t>. הרצת המודל המולטי-מודאלי</w:t>
-      </w:r>
-    </w:p>
-    <w:p>
-      <w:pPr>
-        <w:bidi/>
-      </w:pPr>
-      <w:r>
-        <w:rPr>
-          <w:rtl/>
-        </w:rPr>
-        <w:t>למודל המולטי-מודאלי מריצים:</w:t>
-      </w:r>
-    </w:p>
-    <w:p>
-      <w:r>
-        <w:rPr>
-          <w:rFonts w:ascii="Courier New" w:hAnsi="Courier New"/>
-          <w:sz w:val="19"/>
-        </w:rPr>
-        <w:t>m</w:t>
-      </w:r>
-      <w:r>
-        <w:rPr>
-          <w:rFonts w:ascii="Courier New" w:hAnsi="Courier New"/>
-          <w:sz w:val="19"/>
-        </w:rPr>
-        <w:t>ain_m</w:t>
-      </w:r>
-      <w:r>
-        <w:rPr>
-          <w:rFonts w:ascii="Courier New" w:hAnsi="Courier New"/>
-          <w:sz w:val="19"/>
-        </w:rPr>
-        <w:t>ultimodal_</w:t>
-      </w:r>
-      <w:r>
-        <w:rPr>
-          <w:rFonts w:ascii="Courier New" w:hAnsi="Courier New"/>
-          <w:sz w:val="19"/>
-        </w:rPr>
-        <w:t>cnn</w:t>
-      </w:r>
-      <w:r>
-        <w:rPr>
-          <w:rFonts w:ascii="Courier New" w:hAnsi="Courier New"/>
-          <w:sz w:val="19"/>
-        </w:rPr>
-        <w:t>.py</w:t>
-      </w:r>
-    </w:p>
-    <w:p>
-      <w:pPr>
-        <w:bidi/>
-        <w:rPr>
-          <w:rtl/>
-          <w:lang w:bidi="he-IL"/>
-        </w:rPr>
-      </w:pPr>
-      <w:r>
-        <w:rPr>
-          <w:rtl/>
-        </w:rPr>
-        <w:t>לפני ההרצה יש לוודא שקיימים גם קובצי הספקטרוגרמות וגם קובץ הפיצ'רים המתאים לאותו מצב.</w:t>
-      </w:r>
-    </w:p>
-    <w:p>
-      <w:pPr>
-        <w:bidi/>
-        <w:rPr>
-          <w:rtl/>
-          <w:lang w:bidi="he-IL"/>
-        </w:rPr>
-      </w:pPr>
-      <w:r>
-        <w:rPr>
-          <w:rFonts w:hint="cs"/>
-          <w:rtl/>
-          <w:lang w:bidi="he-IL"/>
-        </w:rPr>
-        <w:t xml:space="preserve">כל </w:t>
-      </w:r>
-      <w:r>
-        <w:rPr>
-          <w:rFonts w:hint="cs"/>
-          <w:rtl/>
-          <w:lang w:bidi="he-IL"/>
-        </w:rPr>
-        <w:t xml:space="preserve">הקבצים בסעיפים </w:t>
-      </w:r>
-      <w:r>
-        <w:rPr>
-          <w:rFonts w:hint="cs"/>
-          <w:rtl/>
-          <w:lang w:bidi="he-IL"/>
-        </w:rPr>
-        <w:t xml:space="preserve">10-13 מצויים גם כמחברת </w:t>
-      </w:r>
-      <w:r>
-        <w:rPr>
-          <w:lang w:bidi="he-IL"/>
-        </w:rPr>
-        <w:t>kaggle</w:t>
-      </w:r>
-      <w:r>
-        <w:rPr>
-          <w:rFonts w:hint="cs"/>
-          <w:rtl/>
-          <w:lang w:bidi="he-IL"/>
-        </w:rPr>
-        <w:t xml:space="preserve"> (קישורים בעמוד הראשון) ומומלץ להריץ ב </w:t>
-      </w:r>
-      <w:r>
-        <w:rPr>
-          <w:lang w:bidi="he-IL"/>
-        </w:rPr>
-        <w:t>kaggle</w:t>
-      </w:r>
-      <w:r>
-        <w:rPr>
-          <w:rFonts w:hint="cs"/>
-          <w:rtl/>
-          <w:lang w:bidi="he-IL"/>
-        </w:rPr>
-        <w:t xml:space="preserve"> לצורך חיסכון משמעותי בזמן ריצה.</w:t>
-      </w:r>
-    </w:p>
-    <w:p>
-      <w:pPr>
-        <w:pStyle w:val="Heading2"/>
-        <w:bidi/>
-      </w:pPr>
-      <w:r>
-        <w:rPr>
-          <w:rFonts w:ascii="Arial" w:hAnsi="Arial" w:hint="cs"/>
-          <w:rtl/>
-          <w:lang w:bidi="he-IL"/>
-        </w:rPr>
-        <w:t>13</w:t>
-      </w:r>
-      <w:r>
-        <w:rPr>
-          <w:rFonts w:ascii="Arial" w:hAnsi="Arial"/>
-          <w:rtl/>
-        </w:rPr>
-        <w:t>. תוצאות וגרפים</w:t>
-      </w:r>
-    </w:p>
-    <w:p>
-      <w:pPr>
-        <w:bidi/>
-      </w:pPr>
-      <w:r>
-        <w:rPr>
-          <w:rtl/>
-        </w:rPr>
-        <w:t xml:space="preserve">ב-Kaggle </w:t>
-      </w:r>
-      <w:r>
-        <w:rPr>
-          <w:rFonts w:hint="cs"/>
-          <w:rtl/>
-          <w:lang w:bidi="he-IL"/>
-        </w:rPr>
-        <w:t>ה</w:t>
-      </w:r>
-      <w:r>
-        <w:rPr>
-          <w:rtl/>
-        </w:rPr>
-        <w:t>גרפים מוצגים ישירות בפלט של המחברת</w:t>
-      </w:r>
-      <w:r>
-        <w:rPr>
-          <w:rFonts w:hint="cs"/>
-          <w:rtl/>
-          <w:lang w:bidi="he-IL"/>
-        </w:rPr>
-        <w:t xml:space="preserve"> וכן ב-</w:t>
-      </w:r>
-      <w:r>
-        <w:rPr>
-          <w:lang w:bidi="he-IL"/>
-        </w:rPr>
-        <w:t>output</w:t>
-      </w:r>
-      <w:r>
-        <w:rPr>
-          <w:rFonts w:hint="cs"/>
-          <w:rtl/>
-          <w:lang w:bidi="he-IL"/>
-        </w:rPr>
-        <w:t xml:space="preserve"> של המחברת</w:t>
-      </w:r>
-      <w:r>
-        <w:rPr>
-          <w:rtl/>
-        </w:rPr>
-        <w:t>.</w:t>
-      </w:r>
-    </w:p>
-    <w:p>
-      <w:pPr>
-        <w:bidi/>
-      </w:pPr>
-      <w:r>
-        <w:rPr>
-          <w:rtl/>
-        </w:rPr>
-        <w:t>בהרצה מקומית ב-PyCharm הגרפים נשמרים גם תחת:</w:t>
-      </w:r>
-    </w:p>
-    <w:p>
-      <w:r>
-        <w:rPr>
-          <w:rFonts w:ascii="Courier New" w:hAnsi="Courier New"/>
-          <w:sz w:val="19"/>
-        </w:rPr>
-        <w:t>graphs/</w:t>
-      </w:r>
-    </w:p>
-    <w:p/>
     <w:sectPr>
       <w:pgSz w:w="12240" w:h="15840"/>
       <w:pgMar w:top="1134" w:right="1247" w:bottom="1134" w:left="1247" w:header="720" w:footer="720" w:gutter="0"/>
@@ -1901,6 +2319,119 @@
       </w:pPr>
       <w:rPr>
         <w:rFonts w:ascii="Symbol" w:hAnsi="Symbol" w:hint="default"/>
+      </w:rPr>
+    </w:lvl>
+  </w:abstractNum>
+  <w:abstractNum w:abstractNumId="9" w15:restartNumberingAfterBreak="0">
+    <w:nsid w:val="491B5F0D"/>
+    <w:multiLevelType w:val="hybridMultilevel"/>
+    <w:tmpl w:val="7AEC23E0"/>
+    <w:lvl w:ilvl="0" w:tplc="04090001">
+      <w:start w:val="1"/>
+      <w:numFmt w:val="bullet"/>
+      <w:lvlText w:val=""/>
+      <w:lvlJc w:val="left"/>
+      <w:pPr>
+        <w:ind w:left="720" w:hanging="360"/>
+      </w:pPr>
+      <w:rPr>
+        <w:rFonts w:ascii="Symbol" w:hAnsi="Symbol" w:hint="default"/>
+      </w:rPr>
+    </w:lvl>
+    <w:lvl w:ilvl="1" w:tplc="04090003" w:tentative="1">
+      <w:start w:val="1"/>
+      <w:numFmt w:val="bullet"/>
+      <w:lvlText w:val="o"/>
+      <w:lvlJc w:val="left"/>
+      <w:pPr>
+        <w:ind w:left="1440" w:hanging="360"/>
+      </w:pPr>
+      <w:rPr>
+        <w:rFonts w:ascii="Courier New" w:hAnsi="Courier New" w:cs="Courier New" w:hint="default"/>
+      </w:rPr>
+    </w:lvl>
+    <w:lvl w:ilvl="2" w:tplc="04090005" w:tentative="1">
+      <w:start w:val="1"/>
+      <w:numFmt w:val="bullet"/>
+      <w:lvlText w:val=""/>
+      <w:lvlJc w:val="left"/>
+      <w:pPr>
+        <w:ind w:left="2160" w:hanging="360"/>
+      </w:pPr>
+      <w:rPr>
+        <w:rFonts w:ascii="Wingdings" w:hAnsi="Wingdings" w:hint="default"/>
+      </w:rPr>
+    </w:lvl>
+    <w:lvl w:ilvl="3" w:tplc="04090001" w:tentative="1">
+      <w:start w:val="1"/>
+      <w:numFmt w:val="bullet"/>
+      <w:lvlText w:val=""/>
+      <w:lvlJc w:val="left"/>
+      <w:pPr>
+        <w:ind w:left="2880" w:hanging="360"/>
+      </w:pPr>
+      <w:rPr>
+        <w:rFonts w:ascii="Symbol" w:hAnsi="Symbol" w:hint="default"/>
+      </w:rPr>
+    </w:lvl>
+    <w:lvl w:ilvl="4" w:tplc="04090003" w:tentative="1">
+      <w:start w:val="1"/>
+      <w:numFmt w:val="bullet"/>
+      <w:lvlText w:val="o"/>
+      <w:lvlJc w:val="left"/>
+      <w:pPr>
+        <w:ind w:left="3600" w:hanging="360"/>
+      </w:pPr>
+      <w:rPr>
+        <w:rFonts w:ascii="Courier New" w:hAnsi="Courier New" w:cs="Courier New" w:hint="default"/>
+      </w:rPr>
+    </w:lvl>
+    <w:lvl w:ilvl="5" w:tplc="04090005" w:tentative="1">
+      <w:start w:val="1"/>
+      <w:numFmt w:val="bullet"/>
+      <w:lvlText w:val=""/>
+      <w:lvlJc w:val="left"/>
+      <w:pPr>
+        <w:ind w:left="4320" w:hanging="360"/>
+      </w:pPr>
+      <w:rPr>
+        <w:rFonts w:ascii="Wingdings" w:hAnsi="Wingdings" w:hint="default"/>
+      </w:rPr>
+    </w:lvl>
+    <w:lvl w:ilvl="6" w:tplc="04090001" w:tentative="1">
+      <w:start w:val="1"/>
+      <w:numFmt w:val="bullet"/>
+      <w:lvlText w:val=""/>
+      <w:lvlJc w:val="left"/>
+      <w:pPr>
+        <w:ind w:left="5040" w:hanging="360"/>
+      </w:pPr>
+      <w:rPr>
+        <w:rFonts w:ascii="Symbol" w:hAnsi="Symbol" w:hint="default"/>
+      </w:rPr>
+    </w:lvl>
+    <w:lvl w:ilvl="7" w:tplc="04090003" w:tentative="1">
+      <w:start w:val="1"/>
+      <w:numFmt w:val="bullet"/>
+      <w:lvlText w:val="o"/>
+      <w:lvlJc w:val="left"/>
+      <w:pPr>
+        <w:ind w:left="5760" w:hanging="360"/>
+      </w:pPr>
+      <w:rPr>
+        <w:rFonts w:ascii="Courier New" w:hAnsi="Courier New" w:cs="Courier New" w:hint="default"/>
+      </w:rPr>
+    </w:lvl>
+    <w:lvl w:ilvl="8" w:tplc="04090005" w:tentative="1">
+      <w:start w:val="1"/>
+      <w:numFmt w:val="bullet"/>
+      <w:lvlText w:val=""/>
+      <w:lvlJc w:val="left"/>
+      <w:pPr>
+        <w:ind w:left="6480" w:hanging="360"/>
+      </w:pPr>
+      <w:rPr>
+        <w:rFonts w:ascii="Wingdings" w:hAnsi="Wingdings" w:hint="default"/>
       </w:rPr>
     </w:lvl>
   </w:abstractNum>
@@ -1930,6 +2461,9 @@
   </w:num>
   <w:num w:numId="9" w16cid:durableId="964506437">
     <w:abstractNumId w:val="0"/>
+  </w:num>
+  <w:num w:numId="10" w16cid:durableId="710760855">
+    <w:abstractNumId w:val="9"/>
   </w:num>
 </w:numbering>
 </file>
@@ -2323,7 +2857,7 @@
   <w:style w:type="paragraph" w:default="1" w:styleId="Normal">
     <w:name w:val="Normal"/>
     <w:qFormat/>
-    <w:rsid w:val="003060FC"/>
+    <w:rsid w:val="00DD1DEB"/>
     <w:rPr>
       <w:rFonts w:ascii="Arial" w:hAnsi="Arial"/>
     </w:rPr>
@@ -13325,6 +13859,41 @@
     <w:rsid w:val="005552DC"/>
     <w:rPr>
       <w:color w:val="666666"/>
+    </w:rPr>
+  </w:style>
+  <w:style w:type="character" w:styleId="Hyperlink">
+    <w:name w:val="Hyperlink"/>
+    <w:basedOn w:val="DefaultParagraphFont"/>
+    <w:uiPriority w:val="99"/>
+    <w:unhideWhenUsed/>
+    <w:rsid w:val="00F84D77"/>
+    <w:rPr>
+      <w:color w:val="0000FF" w:themeColor="hyperlink"/>
+      <w:u w:val="single"/>
+    </w:rPr>
+  </w:style>
+  <w:style w:type="character" w:styleId="UnresolvedMention">
+    <w:name w:val="Unresolved Mention"/>
+    <w:basedOn w:val="DefaultParagraphFont"/>
+    <w:uiPriority w:val="99"/>
+    <w:semiHidden/>
+    <w:unhideWhenUsed/>
+    <w:rsid w:val="00F84D77"/>
+    <w:rPr>
+      <w:color w:val="605E5C"/>
+      <w:shd w:val="clear" w:color="auto" w:fill="E1DFDD"/>
+    </w:rPr>
+  </w:style>
+  <w:style w:type="character" w:styleId="FollowedHyperlink">
+    <w:name w:val="FollowedHyperlink"/>
+    <w:basedOn w:val="DefaultParagraphFont"/>
+    <w:uiPriority w:val="99"/>
+    <w:semiHidden/>
+    <w:unhideWhenUsed/>
+    <w:rsid w:val="00953AE0"/>
+    <w:rPr>
+      <w:color w:val="800080" w:themeColor="followedHyperlink"/>
+      <w:u w:val="single"/>
     </w:rPr>
   </w:style>
 </w:styles>

</xml_diff>